<commit_message>
DPA v2: Update Vercel to EU (Frankfurt) — no transfer mechanism required
</commit_message>
<xml_diff>
--- a/docs/alwaysready-dpa-v2-draft.docx
+++ b/docs/alwaysready-dpa-v2-draft.docx
@@ -1254,7 +1254,7 @@
           <w:sz w:val="22"/>
           <w:szCs w:val="22"/>
         </w:rPr>
-        <w:t xml:space="preserve">Vercel Inc — platform hosting and deployment (United States). Transfer basis: UK International Data Transfer Agreement (IDTA) / Standard Contractual Clauses. [Solicitor: confirm applicable mechanism.]</w:t>
+        <w:t xml:space="preserve">Vercel Inc — platform hosting and deployment. Data processed in Frankfurt, European Union. Transfer basis: EU adequacy decision (UK GDPR Article 45).</w:t>
       </w:r>
     </w:p>
     <w:p>
@@ -2760,7 +2760,7 @@
           <w:sz w:val="22"/>
           <w:szCs w:val="22"/>
         </w:rPr>
-        <w:t xml:space="preserve">Confirm transfer mechanism (UK IDTA or SCCs) for each US Sub-Processor: Vercel, Resend, Anthropic, Upstash, Sentry</w:t>
+        <w:t xml:space="preserve">Confirm transfer mechanism (UK IDTA or SCCs) for each US Sub-Processor: Resend, Anthropic, Upstash, Sentry (Vercel confirmed EU — Frankfurt)</w:t>
       </w:r>
     </w:p>
     <w:p>

</xml_diff>

<commit_message>
DPA v2: Update Resend — EU-U.S. DPF + UK Extension + SCCs confirmed
</commit_message>
<xml_diff>
--- a/docs/alwaysready-dpa-v2-draft.docx
+++ b/docs/alwaysready-dpa-v2-draft.docx
@@ -1276,7 +1276,7 @@
           <w:sz w:val="22"/>
           <w:szCs w:val="22"/>
         </w:rPr>
-        <w:t xml:space="preserve">Resend Inc — transactional email delivery (United States). Transfer basis: UK IDTA / SCCs. [Solicitor: confirm applicable mechanism.]</w:t>
+        <w:t xml:space="preserve">Resend Inc — transactional email delivery (United States). Data stored in the United States even when using EU sending regions. Transfer basis: EU-U.S. Data Privacy Framework (UK Extension) and Standard Contractual Clauses. Resend DPA is pre-signed and becomes active automatically on account creation.</w:t>
       </w:r>
     </w:p>
     <w:p>
@@ -2760,7 +2760,7 @@
           <w:sz w:val="22"/>
           <w:szCs w:val="22"/>
         </w:rPr>
-        <w:t xml:space="preserve">Confirm transfer mechanism (UK IDTA or SCCs) for each US Sub-Processor: Resend, Anthropic, Upstash, Sentry (Vercel confirmed EU — Frankfurt)</w:t>
+        <w:t xml:space="preserve">Confirm transfer mechanism (UK IDTA or SCCs) for each US Sub-Processor: Anthropic, Upstash, Sentry (Vercel: EU Frankfurt; Resend: EU-U.S. DPF + UK Extension + SCCs — confirmed)</w:t>
       </w:r>
     </w:p>
     <w:p>

</xml_diff>

<commit_message>
DPA v2: Update all sub-processor transfer mechanisms from verified sources
- Vercel: Frankfurt EU / EU adequacy decision (no international transfer)
- Resend: EU-U.S. DPF + UK Extension + SCCs (pre-signed, auto-active)
- Anthropic: EU SCCs (Module 2/3) + UK Addendum, incorporated into commercial terms (eff. 24 Feb 2025)
- Upstash: EU-U.S. DPF (primary) + SCCs (fallback) + UK Transfer Addendum
- Sentry: EU SCCs (Module 2) + UK Addendum, EU data storage selectable
- Solicitor checklist updated: transfer mechanisms identified; solicitor to verify currency at execution
</commit_message>
<xml_diff>
--- a/docs/alwaysready-dpa-v2-draft.docx
+++ b/docs/alwaysready-dpa-v2-draft.docx
@@ -1254,7 +1254,7 @@
           <w:sz w:val="22"/>
           <w:szCs w:val="22"/>
         </w:rPr>
-        <w:t xml:space="preserve">Vercel Inc — platform hosting and deployment. Data processed in Frankfurt, European Union. Transfer basis: EU adequacy decision (UK GDPR Article 45).</w:t>
+        <w:t xml:space="preserve">Vercel Inc — platform hosting and deployment. Data processed in Frankfurt, EU. Transfer basis: EU adequacy decision (no international transfer; data remains within the EEA).</w:t>
       </w:r>
     </w:p>
     <w:p>
@@ -1276,7 +1276,7 @@
           <w:sz w:val="22"/>
           <w:szCs w:val="22"/>
         </w:rPr>
-        <w:t xml:space="preserve">Resend Inc — transactional email delivery (United States). Data stored in the United States even when using EU sending regions. Transfer basis: EU-U.S. Data Privacy Framework (UK Extension) and Standard Contractual Clauses. Resend DPA is pre-signed and becomes active automatically on account creation.</w:t>
+        <w:t xml:space="preserve">Resend Inc — transactional email delivery (United States). Transfer basis: EU-U.S. Data Privacy Framework + UK Extension + Standard Contractual Clauses (pre-signed by Resend; auto-active on account creation).</w:t>
       </w:r>
     </w:p>
     <w:p>
@@ -1298,7 +1298,7 @@
           <w:sz w:val="22"/>
           <w:szCs w:val="22"/>
         </w:rPr>
-        <w:t xml:space="preserve">Anthropic PBC — AI-assisted drafting of internal support replies (United States). Support ticket content may be processed. AlwaysReady confirms that personal data is not used to train Anthropic's models under the API terms of service. Transfer basis: UK IDTA / SCCs. [Solicitor: confirm applicable mechanism.]</w:t>
+        <w:t xml:space="preserve">Anthropic PBC — AI-assisted drafting of internal support replies (United States). Support ticket content may be processed. AlwaysReady confirms that personal data is not used to train Anthropic's models under the API terms of service. Transfer basis: EU Standard Contractual Clauses (Module 2 and/or 3) + UK Addendum (ICO IDTA), incorporated automatically into Anthropic's commercial terms of service. (Effective 24 February 2025; see anthropic.com/legal/data-processing-addendum.)</w:t>
       </w:r>
     </w:p>
     <w:p>
@@ -1320,7 +1320,7 @@
           <w:sz w:val="22"/>
           <w:szCs w:val="22"/>
         </w:rPr>
-        <w:t xml:space="preserve">Upstash Inc — Redis-based rate limiting infrastructure (United States). Processes IP addresses and request metadata only; no substantive personal data beyond transient request context. Transfer basis: UK IDTA / SCCs. [Solicitor: confirm applicable mechanism.]</w:t>
+        <w:t xml:space="preserve">Upstash Inc — Redis-based rate limiting infrastructure (United States). Processes IP addresses and request metadata only; no substantive personal data beyond transient request context. Transfer basis: EU-U.S. Data Privacy Framework (primary) + Standard Contractual Clauses (fallback, if DPF is invalidated) + UK Transfer Addendum.</w:t>
       </w:r>
     </w:p>
     <w:p>
@@ -1342,7 +1342,7 @@
           <w:sz w:val="22"/>
           <w:szCs w:val="22"/>
         </w:rPr>
-        <w:t xml:space="preserve">Sentry (Functional Software Inc) — error monitoring and diagnostics (United States). May capture request context and stack traces that incidentally include personal data. Transfer basis: UK IDTA / SCCs. [Solicitor: confirm applicable mechanism.]</w:t>
+        <w:t xml:space="preserve">Sentry (Functional Software Inc) — error monitoring and diagnostics (United States). May capture request context and stack traces that incidentally include personal data. Transfer basis: EU Standard Contractual Clauses (Module 2) + UK Addendum (ICO IDTA), incorporated into Sentry's DPA. EU data storage region selectable. (See sentry.io/legal/dpa/.)</w:t>
       </w:r>
     </w:p>
     <w:p>
@@ -2760,7 +2760,7 @@
           <w:sz w:val="22"/>
           <w:szCs w:val="22"/>
         </w:rPr>
-        <w:t xml:space="preserve">Confirm transfer mechanism (UK IDTA or SCCs) for each US Sub-Processor: Anthropic, Upstash, Sentry (Vercel: EU Frankfurt; Resend: EU-U.S. DPF + UK Extension + SCCs — confirmed)</w:t>
+        <w:t xml:space="preserve">Transfer mechanisms in clause 8.2 have been identified from each sub-processor's published DPA. Solicitor to verify each mechanism remains current and adequate at time of execution.</w:t>
       </w:r>
     </w:p>
     <w:p>

</xml_diff>

<commit_message>
DPA v2: Add Cloudmersive as confirmed sub-processor
- Virus scanning of uploaded files (docx, xlsx, PDF, images)
- EU/UK data centre available (Frankfurt/London) — no international transfer if configured
- DPA available at cloudmersive.com/data-processing-dpa
- Action required: execute DPA with Cloudmersive sales team + confirm EU/UK region selected
</commit_message>
<xml_diff>
--- a/docs/alwaysready-dpa-v2-draft.docx
+++ b/docs/alwaysready-dpa-v2-draft.docx
@@ -1364,7 +1364,7 @@
           <w:sz w:val="22"/>
           <w:szCs w:val="22"/>
         </w:rPr>
-        <w:t xml:space="preserve">[Solicitor: confirm whether Cloudmersive (virus scanning) is still in use. If so, add here with transfer basis.]</w:t>
+        <w:t xml:space="preserve">Cloudmersive, LLC — virus scanning of uploaded files prior to storage (United States). Scans .docx, .xlsx, PDF, JPG, and PNG files uploaded by users via the Platform's evidence upload feature. AlwaysReady uses Cloudmersive's EU or UK data centre region; no personal data is transferred to the United States. Transfer basis: no international transfer where EU/UK data centre is selected; EU SCCs and/or Alternative Transfer Solution available under Cloudmersive DPA if applicable. Note: Cloudmersive's DPA must be actively accepted by contacting Cloudmersive sales (cloudmersive.com/data-processing-dpa) — it is not auto-incorporated. Action required: confirm UK/EU data centre is selected in the Cloudmersive account settings, and execute the DPA with Cloudmersive.</w:t>
       </w:r>
     </w:p>
     <w:p>
@@ -2778,7 +2778,7 @@
           <w:sz w:val="22"/>
           <w:szCs w:val="22"/>
         </w:rPr>
-        <w:t xml:space="preserve">Confirm whether Cloudmersive (virus scanning) is still in use; add to clause 8.2 if so</w:t>
+        <w:t xml:space="preserve">Cloudmersive DPA must be actively executed by contacting their sales team — it is not auto-incorporated. Confirm UK/EU data centre region is selected before execution.</w:t>
       </w:r>
     </w:p>
     <w:p>

</xml_diff>